<commit_message>
Actualizo recomendaciones del docx sobre el reto adicional
</commit_message>
<xml_diff>
--- a/IV-Trimestre/trabajo-en-equipo/Diseño_Web_Actividad_2.docx
+++ b/IV-Trimestre/trabajo-en-equipo/Diseño_Web_Actividad_2.docx
@@ -89,19 +89,6 @@
     <w:p>
       <w:pPr>
         <w:spacing w:after="0" w:line="480"/>
-      </w:pPr>
-      <w:r>
-        <w:rPr>
-          <w:rFonts w:ascii="Times New Roman" w:cs="Times New Roman" w:eastAsia="Times New Roman" w:hAnsi="Times New Roman"/>
-          <w:sz w:val="24"/>
-          <w:szCs w:val="24"/>
-        </w:rPr>
-        <w:t xml:space="preserve"/>
-      </w:r>
-    </w:p>
-    <w:p>
-      <w:pPr>
-        <w:spacing w:after="0" w:line="480"/>
         <w:jc w:val="center"/>
       </w:pPr>
       <w:r>
@@ -112,7 +99,20 @@
           <w:sz w:val="24"/>
           <w:szCs w:val="24"/>
         </w:rPr>
-        <w:t xml:space="preserve">Oscar Duvan Rojas Rico</w:t>
+        <w:t xml:space="preserve">Presentado por</w:t>
+      </w:r>
+    </w:p>
+    <w:p>
+      <w:pPr>
+        <w:spacing w:after="0" w:line="480"/>
+      </w:pPr>
+      <w:r>
+        <w:rPr>
+          <w:rFonts w:ascii="Times New Roman" w:cs="Times New Roman" w:eastAsia="Times New Roman" w:hAnsi="Times New Roman"/>
+          <w:sz w:val="24"/>
+          <w:szCs w:val="24"/>
+        </w:rPr>
+        <w:t xml:space="preserve"/>
       </w:r>
     </w:p>
     <w:p>
@@ -128,33 +128,7 @@
           <w:sz w:val="24"/>
           <w:szCs w:val="24"/>
         </w:rPr>
-        <w:t xml:space="preserve">Santiago Díaz Palma</w:t>
-      </w:r>
-    </w:p>
-    <w:p>
-      <w:pPr>
-        <w:spacing w:after="0" w:line="480"/>
-      </w:pPr>
-      <w:r>
-        <w:rPr>
-          <w:rFonts w:ascii="Times New Roman" w:cs="Times New Roman" w:eastAsia="Times New Roman" w:hAnsi="Times New Roman"/>
-          <w:sz w:val="24"/>
-          <w:szCs w:val="24"/>
-        </w:rPr>
-        <w:t xml:space="preserve"/>
-      </w:r>
-    </w:p>
-    <w:p>
-      <w:pPr>
-        <w:spacing w:after="0" w:line="480"/>
-      </w:pPr>
-      <w:r>
-        <w:rPr>
-          <w:rFonts w:ascii="Times New Roman" w:cs="Times New Roman" w:eastAsia="Times New Roman" w:hAnsi="Times New Roman"/>
-          <w:sz w:val="24"/>
-          <w:szCs w:val="24"/>
-        </w:rPr>
-        <w:t xml:space="preserve"/>
+        <w:t xml:space="preserve">Oscar Duvan Rojas Rico</w:t>
       </w:r>
     </w:p>
     <w:p>
@@ -170,7 +144,33 @@
           <w:sz w:val="24"/>
           <w:szCs w:val="24"/>
         </w:rPr>
-        <w:t xml:space="preserve">Servicio Nacional de Aprendizaje (SENA)</w:t>
+        <w:t xml:space="preserve">Santiago Díaz Palma</w:t>
+      </w:r>
+    </w:p>
+    <w:p>
+      <w:pPr>
+        <w:spacing w:after="0" w:line="480"/>
+      </w:pPr>
+      <w:r>
+        <w:rPr>
+          <w:rFonts w:ascii="Times New Roman" w:cs="Times New Roman" w:eastAsia="Times New Roman" w:hAnsi="Times New Roman"/>
+          <w:sz w:val="24"/>
+          <w:szCs w:val="24"/>
+        </w:rPr>
+        <w:t xml:space="preserve"/>
+      </w:r>
+    </w:p>
+    <w:p>
+      <w:pPr>
+        <w:spacing w:after="0" w:line="480"/>
+      </w:pPr>
+      <w:r>
+        <w:rPr>
+          <w:rFonts w:ascii="Times New Roman" w:cs="Times New Roman" w:eastAsia="Times New Roman" w:hAnsi="Times New Roman"/>
+          <w:sz w:val="24"/>
+          <w:szCs w:val="24"/>
+        </w:rPr>
+        <w:t xml:space="preserve"/>
       </w:r>
     </w:p>
     <w:p>
@@ -186,7 +186,7 @@
           <w:sz w:val="24"/>
           <w:szCs w:val="24"/>
         </w:rPr>
-        <w:t xml:space="preserve">Centro de Industria y Construcción - Regional Tolima</w:t>
+        <w:t xml:space="preserve">Servicio Nacional de Aprendizaje (SENA)</w:t>
       </w:r>
     </w:p>
     <w:p>
@@ -202,7 +202,7 @@
           <w:sz w:val="24"/>
           <w:szCs w:val="24"/>
         </w:rPr>
-        <w:t xml:space="preserve">Análisis y Desarrollo de Software (ADSO)</w:t>
+        <w:t xml:space="preserve">Centro de Industria y Construcción - Regional Tolima</w:t>
       </w:r>
     </w:p>
     <w:p>
@@ -218,33 +218,7 @@
           <w:sz w:val="24"/>
           <w:szCs w:val="24"/>
         </w:rPr>
-        <w:t xml:space="preserve">Ficha 3400991 - IV Trimestre</w:t>
-      </w:r>
-    </w:p>
-    <w:p>
-      <w:pPr>
-        <w:spacing w:after="0" w:line="480"/>
-      </w:pPr>
-      <w:r>
-        <w:rPr>
-          <w:rFonts w:ascii="Times New Roman" w:cs="Times New Roman" w:eastAsia="Times New Roman" w:hAnsi="Times New Roman"/>
-          <w:sz w:val="24"/>
-          <w:szCs w:val="24"/>
-        </w:rPr>
-        <w:t xml:space="preserve"/>
-      </w:r>
-    </w:p>
-    <w:p>
-      <w:pPr>
-        <w:spacing w:after="0" w:line="480"/>
-      </w:pPr>
-      <w:r>
-        <w:rPr>
-          <w:rFonts w:ascii="Times New Roman" w:cs="Times New Roman" w:eastAsia="Times New Roman" w:hAnsi="Times New Roman"/>
-          <w:sz w:val="24"/>
-          <w:szCs w:val="24"/>
-        </w:rPr>
-        <w:t xml:space="preserve"/>
+        <w:t xml:space="preserve">Análisis y Desarrollo de Software (ADSO)</w:t>
       </w:r>
     </w:p>
     <w:p>
@@ -260,7 +234,7 @@
           <w:sz w:val="24"/>
           <w:szCs w:val="24"/>
         </w:rPr>
-        <w:t xml:space="preserve">Instructora: Sandra Milena Cruz Molano</w:t>
+        <w:t xml:space="preserve">Ficha 3400991 - IV Trimestre</w:t>
       </w:r>
     </w:p>
     <w:p>
@@ -302,7 +276,33 @@
           <w:sz w:val="24"/>
           <w:szCs w:val="24"/>
         </w:rPr>
-        <w:t xml:space="preserve">Ibagué, Tolima</w:t>
+        <w:t xml:space="preserve">Instructora: Sandra Milena Cruz Molano</w:t>
+      </w:r>
+    </w:p>
+    <w:p>
+      <w:pPr>
+        <w:spacing w:after="0" w:line="480"/>
+      </w:pPr>
+      <w:r>
+        <w:rPr>
+          <w:rFonts w:ascii="Times New Roman" w:cs="Times New Roman" w:eastAsia="Times New Roman" w:hAnsi="Times New Roman"/>
+          <w:sz w:val="24"/>
+          <w:szCs w:val="24"/>
+        </w:rPr>
+        <w:t xml:space="preserve"/>
+      </w:r>
+    </w:p>
+    <w:p>
+      <w:pPr>
+        <w:spacing w:after="0" w:line="480"/>
+      </w:pPr>
+      <w:r>
+        <w:rPr>
+          <w:rFonts w:ascii="Times New Roman" w:cs="Times New Roman" w:eastAsia="Times New Roman" w:hAnsi="Times New Roman"/>
+          <w:sz w:val="24"/>
+          <w:szCs w:val="24"/>
+        </w:rPr>
+        <w:t xml:space="preserve"/>
       </w:r>
     </w:p>
     <w:p>
@@ -318,6 +318,22 @@
           <w:sz w:val="24"/>
           <w:szCs w:val="24"/>
         </w:rPr>
+        <w:t xml:space="preserve">Ibagué, Tolima</w:t>
+      </w:r>
+    </w:p>
+    <w:p>
+      <w:pPr>
+        <w:spacing w:after="0" w:line="480"/>
+        <w:jc w:val="center"/>
+      </w:pPr>
+      <w:r>
+        <w:rPr>
+          <w:rFonts w:ascii="Times New Roman" w:cs="Times New Roman" w:eastAsia="Times New Roman" w:hAnsi="Times New Roman"/>
+          <w:b w:val="false"/>
+          <w:bCs w:val="false"/>
+          <w:sz w:val="24"/>
+          <w:szCs w:val="24"/>
+        </w:rPr>
         <w:t xml:space="preserve">24 de octubre de 2026</w:t>
       </w:r>
     </w:p>
@@ -405,7 +421,7 @@
           <w:sz w:val="24"/>
           <w:szCs w:val="24"/>
         </w:rPr>
-        <w:t xml:space="preserve">A continuación se comparte el enlace al repositorio donde reposan todos los ejercicios del taller de HTML, incluyendo el ejercicio 16 y el reto adicional (guía para empezar con Python):</w:t>
+        <w:t xml:space="preserve">A continuación se comparte el enlace al repositorio donde están todos los ejercicios del taller de HTML, incluyendo el reto adicional (guía para empezar con Python):</w:t>
       </w:r>
     </w:p>
     <w:p>
@@ -426,7 +442,7 @@
         <w:spacing w:after="0" w:line="480"/>
         <w:jc w:val="left"/>
       </w:pPr>
-      <w:hyperlink w:history="1" r:id="rIdjnzgtl2rndrdjtb0r0hpk">
+      <w:hyperlink w:history="1" r:id="rIdgrmbpsdux2ttpfllisu8r">
         <w:r>
           <w:rPr>
             <w:rStyle w:val="Hyperlink"/>
@@ -466,7 +482,7 @@
           <w:sz w:val="24"/>
           <w:szCs w:val="24"/>
         </w:rPr>
-        <w:t xml:space="preserve">Aprendices revisados</w:t>
+        <w:t xml:space="preserve">Aprendices que revisaron nuestro trabajo</w:t>
       </w:r>
     </w:p>
     <w:p>
@@ -494,7 +510,7 @@
           <w:sz w:val="24"/>
           <w:szCs w:val="24"/>
         </w:rPr>
-        <w:t xml:space="preserve">Como parte de la actividad en equipo revisamos el taller de dos compañeros del grupo de formación. Los aprendices cuyos trabajos revisamos fueron Santiago Evanz Cabezas Cortes y Jhean Carlos Useche Vásquez. A partir de esa revisión preparamos tres recomendaciones que consideramos pueden ayudarles a mejorar sus próximos talleres.</w:t>
+        <w:t xml:space="preserve">Como parte de la actividad en equipo, nuestros compañeros Santiago Evanz Cabezas Cortes y Jhean Carlos Useche Vásquez revisaron nuestro reto adicional, la guía "Primeros pasos con Python". A continuación compartimos las tres recomendaciones que nos dieron para mejorarla.</w:t>
       </w:r>
     </w:p>
     <w:p>
@@ -523,7 +539,7 @@
           <w:sz w:val="24"/>
           <w:szCs w:val="24"/>
         </w:rPr>
-        <w:t xml:space="preserve">Recomendaciones</w:t>
+        <w:t xml:space="preserve">Recomendaciones del grupo de Santiago Evanz y Jhean Carlos, respecto a nuestro reto</w:t>
       </w:r>
     </w:p>
     <w:p>
@@ -551,7 +567,7 @@
           <w:sz w:val="24"/>
           <w:szCs w:val="24"/>
         </w:rPr>
-        <w:t xml:space="preserve">1. Organizar mejor los nombres de los archivos y las carpetas. En algunos ejercicios notamos que los archivos tenían nombres parecidos o estaban por fuera de la carpeta "ejercicios", lo que puede confundir al momento de abrir los enlaces del index.html. Les recomendamos usar nombres cortos como ejercicio-1.html, ejercicio-2.html y guardar siempre las imágenes en la carpeta "imagenes" como lo pide la guía.</w:t>
+        <w:t xml:space="preserve">1. Agregar un índice de contenidos al inicio de la guía con enlaces internos a cada sección. La guía quedó bastante larga y quien la abre por primera vez debe desplazarse hasta encontrar el tema que necesita. Con un índice al principio, el lector llega directamente a lo que le interesa, ya sea la instalación, los conceptos básicos o los errores comunes.</w:t>
       </w:r>
     </w:p>
     <w:p>
@@ -579,7 +595,7 @@
           <w:sz w:val="24"/>
           <w:szCs w:val="24"/>
         </w:rPr>
-        <w:t xml:space="preserve">2. Cerrar bien todas las etiquetas y respetar la jerarquía de títulos. En varios ejercicios encontramos etiquetas &lt;tr&gt; o &lt;td&gt; que no cerraban en el orden correcto, y en otros usaban h5 cuando el ejercicio pedía h2 o h3. Esto hace que la página se vea desordenada en el navegador. La recomendación es revisar siempre el código antes de subirlo y usar la indentación de Visual Studio Code para notar cuando falta un cierre.</w:t>
+        <w:t xml:space="preserve">2. Mostrar los tipos de datos y los operadores en tablas más completas. Esa información aparece mezclada entre párrafos y listas, y obliga a leer todo seguido para encontrarla. Presentándola en una tabla con el nombre, un ejemplo y una pequeña explicación, el aprendiz nuevo entiende de un solo vistazo en qué se diferencia un int de un float o un str de un bool.</w:t>
       </w:r>
     </w:p>
     <w:p>
@@ -607,7 +623,7 @@
           <w:sz w:val="24"/>
           <w:szCs w:val="24"/>
         </w:rPr>
-        <w:t xml:space="preserve">3. Agregar siempre un enlace para volver al index.html al final de cada ejercicio. Nos dimos cuenta que algunos ejercicios no tenían el enlace de regreso, entonces para volver al menú principal había que devolverse con la flecha del navegador. Poniendo un &lt;a&gt; con el texto "Volver al inicio" al final de cada página la navegación queda mucho más cómoda y es un detalle que suma en la evaluación.</w:t>
+        <w:t xml:space="preserve">3. Incluir un pequeño ejercicio práctico al final de cada sección. La guía explica muy bien la teoría, pero el aprendiz nuevo aprende más cuando escribe el código por su cuenta. Agregando una pregunta corta o un reto de dos o tres líneas al final de cada tema (variables, condicionales, ciclos), el lector practica en el momento y no se le olvida tan rápido lo que acaba de leer.</w:t>
       </w:r>
     </w:p>
     <w:sectPr>

</xml_diff>

<commit_message>
Agrego tabla de contenido y referencias al documento
</commit_message>
<xml_diff>
--- a/IV-Trimestre/trabajo-en-equipo/Diseño_Web_Actividad_2.docx
+++ b/IV-Trimestre/trabajo-en-equipo/Diseño_Web_Actividad_2.docx
@@ -364,19 +364,133 @@
           <w:sz w:val="24"/>
           <w:szCs w:val="24"/>
         </w:rPr>
-        <w:t xml:space="preserve">Taller HTML: Reconocimiento y aplicación de etiquetas HTML</w:t>
-      </w:r>
-    </w:p>
-    <w:p>
-      <w:pPr>
-        <w:spacing w:after="0" w:line="480"/>
-      </w:pPr>
-      <w:r>
-        <w:rPr>
-          <w:rFonts w:ascii="Times New Roman" w:cs="Times New Roman" w:eastAsia="Times New Roman" w:hAnsi="Times New Roman"/>
-          <w:sz w:val="24"/>
-          <w:szCs w:val="24"/>
-        </w:rPr>
+        <w:t xml:space="preserve">Tabla de contenido</w:t>
+      </w:r>
+    </w:p>
+    <w:p>
+      <w:pPr>
+        <w:spacing w:after="0" w:line="480"/>
+      </w:pPr>
+      <w:r>
+        <w:rPr>
+          <w:rFonts w:ascii="Times New Roman" w:cs="Times New Roman" w:eastAsia="Times New Roman" w:hAnsi="Times New Roman"/>
+          <w:sz w:val="24"/>
+          <w:szCs w:val="24"/>
+        </w:rPr>
+        <w:t xml:space="preserve"/>
+      </w:r>
+    </w:p>
+    <w:p>
+      <w:pPr>
+        <w:tabs>
+          <w:tab w:val="right" w:pos="9000" w:leader="dot"/>
+        </w:tabs>
+        <w:spacing w:after="0" w:line="480"/>
+        <w:jc w:val="left"/>
+      </w:pPr>
+      <w:r>
+        <w:rPr>
+          <w:rFonts w:ascii="Times New Roman" w:cs="Times New Roman" w:eastAsia="Times New Roman" w:hAnsi="Times New Roman"/>
+          <w:sz w:val="24"/>
+          <w:szCs w:val="24"/>
+        </w:rPr>
+        <w:t xml:space="preserve">Repositorio en GitHub</w:t>
+      </w:r>
+      <w:r>
+        <w:rPr>
+          <w:rFonts w:ascii="Times New Roman" w:cs="Times New Roman" w:eastAsia="Times New Roman" w:hAnsi="Times New Roman"/>
+          <w:sz w:val="24"/>
+          <w:szCs w:val="24"/>
+        </w:rPr>
+        <w:t xml:space="preserve">	3</w:t>
+      </w:r>
+    </w:p>
+    <w:p>
+      <w:pPr>
+        <w:tabs>
+          <w:tab w:val="right" w:pos="9000" w:leader="dot"/>
+        </w:tabs>
+        <w:spacing w:after="0" w:line="480"/>
+        <w:jc w:val="left"/>
+      </w:pPr>
+      <w:r>
+        <w:rPr>
+          <w:rFonts w:ascii="Times New Roman" w:cs="Times New Roman" w:eastAsia="Times New Roman" w:hAnsi="Times New Roman"/>
+          <w:sz w:val="24"/>
+          <w:szCs w:val="24"/>
+        </w:rPr>
+        <w:t xml:space="preserve">Aprendices que revisaron nuestro trabajo</w:t>
+      </w:r>
+      <w:r>
+        <w:rPr>
+          <w:rFonts w:ascii="Times New Roman" w:cs="Times New Roman" w:eastAsia="Times New Roman" w:hAnsi="Times New Roman"/>
+          <w:sz w:val="24"/>
+          <w:szCs w:val="24"/>
+        </w:rPr>
+        <w:t xml:space="preserve">	3</w:t>
+      </w:r>
+    </w:p>
+    <w:p>
+      <w:pPr>
+        <w:tabs>
+          <w:tab w:val="right" w:pos="9000" w:leader="dot"/>
+        </w:tabs>
+        <w:spacing w:after="0" w:line="480"/>
+        <w:jc w:val="left"/>
+      </w:pPr>
+      <w:r>
+        <w:rPr>
+          <w:rFonts w:ascii="Times New Roman" w:cs="Times New Roman" w:eastAsia="Times New Roman" w:hAnsi="Times New Roman"/>
+          <w:sz w:val="24"/>
+          <w:szCs w:val="24"/>
+        </w:rPr>
+        <w:t xml:space="preserve">Recomendaciones del grupo de Santiago Evanz y Jhean Carlos</w:t>
+      </w:r>
+      <w:r>
+        <w:rPr>
+          <w:rFonts w:ascii="Times New Roman" w:cs="Times New Roman" w:eastAsia="Times New Roman" w:hAnsi="Times New Roman"/>
+          <w:sz w:val="24"/>
+          <w:szCs w:val="24"/>
+        </w:rPr>
+        <w:t xml:space="preserve">	3</w:t>
+      </w:r>
+    </w:p>
+    <w:p>
+      <w:pPr>
+        <w:tabs>
+          <w:tab w:val="right" w:pos="9000" w:leader="dot"/>
+        </w:tabs>
+        <w:spacing w:after="0" w:line="480"/>
+        <w:jc w:val="left"/>
+      </w:pPr>
+      <w:r>
+        <w:rPr>
+          <w:rFonts w:ascii="Times New Roman" w:cs="Times New Roman" w:eastAsia="Times New Roman" w:hAnsi="Times New Roman"/>
+          <w:sz w:val="24"/>
+          <w:szCs w:val="24"/>
+        </w:rPr>
+        <w:t xml:space="preserve">Referencias</w:t>
+      </w:r>
+      <w:r>
+        <w:rPr>
+          <w:rFonts w:ascii="Times New Roman" w:cs="Times New Roman" w:eastAsia="Times New Roman" w:hAnsi="Times New Roman"/>
+          <w:sz w:val="24"/>
+          <w:szCs w:val="24"/>
+        </w:rPr>
+        <w:t xml:space="preserve">	4</w:t>
+      </w:r>
+    </w:p>
+    <w:p>
+      <w:pPr>
+        <w:pageBreakBefore/>
+      </w:pPr>
+      <w:r>
+        <w:rPr>
+          <w:rFonts w:ascii="Times New Roman" w:cs="Times New Roman" w:eastAsia="Times New Roman" w:hAnsi="Times New Roman"/>
+          <w:sz w:val="24"/>
+          <w:szCs w:val="24"/>
+        </w:rPr>
+        <w:br/>
         <w:t xml:space="preserve"/>
       </w:r>
     </w:p>
@@ -393,6 +507,35 @@
           <w:sz w:val="24"/>
           <w:szCs w:val="24"/>
         </w:rPr>
+        <w:t xml:space="preserve">Taller HTML: Reconocimiento y aplicación de etiquetas HTML</w:t>
+      </w:r>
+    </w:p>
+    <w:p>
+      <w:pPr>
+        <w:spacing w:after="0" w:line="480"/>
+      </w:pPr>
+      <w:r>
+        <w:rPr>
+          <w:rFonts w:ascii="Times New Roman" w:cs="Times New Roman" w:eastAsia="Times New Roman" w:hAnsi="Times New Roman"/>
+          <w:sz w:val="24"/>
+          <w:szCs w:val="24"/>
+        </w:rPr>
+        <w:t xml:space="preserve"/>
+      </w:r>
+    </w:p>
+    <w:p>
+      <w:pPr>
+        <w:spacing w:after="0" w:line="480"/>
+        <w:jc w:val="center"/>
+      </w:pPr>
+      <w:r>
+        <w:rPr>
+          <w:rFonts w:ascii="Times New Roman" w:cs="Times New Roman" w:eastAsia="Times New Roman" w:hAnsi="Times New Roman"/>
+          <w:b/>
+          <w:bCs/>
+          <w:sz w:val="24"/>
+          <w:szCs w:val="24"/>
+        </w:rPr>
         <w:t xml:space="preserve">Repositorio en GitHub</w:t>
       </w:r>
     </w:p>
@@ -442,7 +585,7 @@
         <w:spacing w:after="0" w:line="480"/>
         <w:jc w:val="left"/>
       </w:pPr>
-      <w:hyperlink w:history="1" r:id="rIdgrmbpsdux2ttpfllisu8r">
+      <w:hyperlink w:history="1" r:id="rIdwrssldjk_5jvlritq1fzs">
         <w:r>
           <w:rPr>
             <w:rStyle w:val="Hyperlink"/>
@@ -625,6 +768,156 @@
         </w:rPr>
         <w:t xml:space="preserve">3. Incluir un pequeño ejercicio práctico al final de cada sección. La guía explica muy bien la teoría, pero el aprendiz nuevo aprende más cuando escribe el código por su cuenta. Agregando una pregunta corta o un reto de dos o tres líneas al final de cada tema (variables, condicionales, ciclos), el lector practica en el momento y no se le olvida tan rápido lo que acaba de leer.</w:t>
       </w:r>
+    </w:p>
+    <w:p>
+      <w:pPr>
+        <w:pageBreakBefore/>
+      </w:pPr>
+      <w:r>
+        <w:rPr>
+          <w:rFonts w:ascii="Times New Roman" w:cs="Times New Roman" w:eastAsia="Times New Roman" w:hAnsi="Times New Roman"/>
+          <w:sz w:val="24"/>
+          <w:szCs w:val="24"/>
+        </w:rPr>
+        <w:br/>
+        <w:t xml:space="preserve"/>
+      </w:r>
+    </w:p>
+    <w:p>
+      <w:pPr>
+        <w:spacing w:after="0" w:line="480"/>
+        <w:jc w:val="center"/>
+      </w:pPr>
+      <w:r>
+        <w:rPr>
+          <w:rFonts w:ascii="Times New Roman" w:cs="Times New Roman" w:eastAsia="Times New Roman" w:hAnsi="Times New Roman"/>
+          <w:b/>
+          <w:bCs/>
+          <w:sz w:val="24"/>
+          <w:szCs w:val="24"/>
+        </w:rPr>
+        <w:t xml:space="preserve">Referencias</w:t>
+      </w:r>
+    </w:p>
+    <w:p>
+      <w:pPr>
+        <w:spacing w:after="0" w:line="480"/>
+      </w:pPr>
+      <w:r>
+        <w:rPr>
+          <w:rFonts w:ascii="Times New Roman" w:cs="Times New Roman" w:eastAsia="Times New Roman" w:hAnsi="Times New Roman"/>
+          <w:sz w:val="24"/>
+          <w:szCs w:val="24"/>
+        </w:rPr>
+        <w:t xml:space="preserve"/>
+      </w:r>
+    </w:p>
+    <w:p>
+      <w:pPr>
+        <w:spacing w:after="0" w:line="480"/>
+        <w:ind w:left="720" w:hanging="720"/>
+        <w:jc w:val="left"/>
+      </w:pPr>
+      <w:r>
+        <w:rPr>
+          <w:rFonts w:ascii="Times New Roman" w:cs="Times New Roman" w:eastAsia="Times New Roman" w:hAnsi="Times New Roman"/>
+          <w:sz w:val="24"/>
+          <w:szCs w:val="24"/>
+        </w:rPr>
+        <w:t xml:space="preserve">Python Software Foundation. (2026). El tutorial de Python. Documentación oficial de Python en español. </w:t>
+      </w:r>
+      <w:hyperlink w:history="1" r:id="rIdki4rlit3mfxfo-2tmoqri">
+        <w:r>
+          <w:rPr>
+            <w:rFonts w:ascii="Times New Roman" w:cs="Times New Roman" w:eastAsia="Times New Roman" w:hAnsi="Times New Roman"/>
+            <w:color w:val="0000EE"/>
+            <w:sz w:val="24"/>
+            <w:szCs w:val="24"/>
+            <w:u w:val="single"/>
+          </w:rPr>
+          <w:t xml:space="preserve">https://docs.python.org/es/3/tutorial/</w:t>
+        </w:r>
+      </w:hyperlink>
+    </w:p>
+    <w:p>
+      <w:pPr>
+        <w:spacing w:after="0" w:line="480"/>
+      </w:pPr>
+      <w:r>
+        <w:rPr>
+          <w:rFonts w:ascii="Times New Roman" w:cs="Times New Roman" w:eastAsia="Times New Roman" w:hAnsi="Times New Roman"/>
+          <w:sz w:val="24"/>
+          <w:szCs w:val="24"/>
+        </w:rPr>
+        <w:t xml:space="preserve"/>
+      </w:r>
+    </w:p>
+    <w:p>
+      <w:pPr>
+        <w:spacing w:after="0" w:line="480"/>
+        <w:ind w:left="720" w:hanging="720"/>
+        <w:jc w:val="left"/>
+      </w:pPr>
+      <w:r>
+        <w:rPr>
+          <w:rFonts w:ascii="Times New Roman" w:cs="Times New Roman" w:eastAsia="Times New Roman" w:hAnsi="Times New Roman"/>
+          <w:sz w:val="24"/>
+          <w:szCs w:val="24"/>
+        </w:rPr>
+        <w:t xml:space="preserve">Servicio Nacional de Aprendizaje (SENA). (s.f.). Formación profesional integral. </w:t>
+      </w:r>
+      <w:hyperlink w:history="1" r:id="rIdp_c3aegpx-hnglnn7fx8p">
+        <w:r>
+          <w:rPr>
+            <w:rFonts w:ascii="Times New Roman" w:cs="Times New Roman" w:eastAsia="Times New Roman" w:hAnsi="Times New Roman"/>
+            <w:color w:val="0000EE"/>
+            <w:sz w:val="24"/>
+            <w:szCs w:val="24"/>
+            <w:u w:val="single"/>
+          </w:rPr>
+          <w:t xml:space="preserve">https://www.sena.edu.co/</w:t>
+        </w:r>
+      </w:hyperlink>
+    </w:p>
+    <w:p>
+      <w:pPr>
+        <w:spacing w:after="0" w:line="480"/>
+      </w:pPr>
+      <w:r>
+        <w:rPr>
+          <w:rFonts w:ascii="Times New Roman" w:cs="Times New Roman" w:eastAsia="Times New Roman" w:hAnsi="Times New Roman"/>
+          <w:sz w:val="24"/>
+          <w:szCs w:val="24"/>
+        </w:rPr>
+        <w:t xml:space="preserve"/>
+      </w:r>
+    </w:p>
+    <w:p>
+      <w:pPr>
+        <w:spacing w:after="0" w:line="480"/>
+        <w:ind w:left="720" w:hanging="720"/>
+        <w:jc w:val="left"/>
+      </w:pPr>
+      <w:r>
+        <w:rPr>
+          <w:rFonts w:ascii="Times New Roman" w:cs="Times New Roman" w:eastAsia="Times New Roman" w:hAnsi="Times New Roman"/>
+          <w:sz w:val="24"/>
+          <w:szCs w:val="24"/>
+        </w:rPr>
+        <w:t xml:space="preserve">Mozilla Developer Network. (2026). HTML: Lenguaje de etiquetas de hipertexto. MDN Web Docs en español. </w:t>
+      </w:r>
+      <w:hyperlink w:history="1" r:id="rIddlvv3kwnmoxbz2xfuwp-h">
+        <w:r>
+          <w:rPr>
+            <w:rFonts w:ascii="Times New Roman" w:cs="Times New Roman" w:eastAsia="Times New Roman" w:hAnsi="Times New Roman"/>
+            <w:color w:val="0000EE"/>
+            <w:sz w:val="24"/>
+            <w:szCs w:val="24"/>
+            <w:u w:val="single"/>
+          </w:rPr>
+          <w:t xml:space="preserve">https://developer.mozilla.org/es/docs/Web/HTML</w:t>
+        </w:r>
+      </w:hyperlink>
     </w:p>
     <w:sectPr>
       <w:pgSz w:w="12240" w:h="15840" w:orient="portrait"/>

</xml_diff>